<commit_message>
updated SRS a bit
</commit_message>
<xml_diff>
--- a/Presentation_Reports/Group_09_SRS.docx
+++ b/Presentation_Reports/Group_09_SRS.docx
@@ -1,6 +1,6 @@
 
 <file path=word/document.xml><?xml version="1.0" encoding="utf-8"?>
-<w:document xmlns:wpc="http://schemas.microsoft.com/office/word/2010/wordprocessingCanvas" xmlns:cx="http://schemas.microsoft.com/office/drawing/2014/chartex" xmlns:cx1="http://schemas.microsoft.com/office/drawing/2015/9/8/chartex" xmlns:cx2="http://schemas.microsoft.com/office/drawing/2015/10/21/chartex" xmlns:cx3="http://schemas.microsoft.com/office/drawing/2016/5/9/chartex" xmlns:cx4="http://schemas.microsoft.com/office/drawing/2016/5/10/chartex" xmlns:cx5="http://schemas.microsoft.com/office/drawing/2016/5/11/chartex" xmlns:cx6="http://schemas.microsoft.com/office/drawing/2016/5/12/chartex" xmlns:cx7="http://schemas.microsoft.com/office/drawing/2016/5/13/chartex" xmlns:cx8="http://schemas.microsoft.com/office/drawing/2016/5/14/chartex" xmlns:mc="http://schemas.openxmlformats.org/markup-compatibility/2006" xmlns:aink="http://schemas.microsoft.com/office/drawing/2016/ink" xmlns:am3d="http://schemas.microsoft.com/office/drawing/2017/model3d" xmlns:o="urn:schemas-microsoft-com:office:office" xmlns:oel="http://schemas.microsoft.com/office/2019/extlst" xmlns:r="http://schemas.openxmlformats.org/officeDocument/2006/relationships" xmlns:m="http://schemas.openxmlformats.org/officeDocument/2006/math" xmlns:v="urn:schemas-microsoft-com:vml" xmlns:wp14="http://schemas.microsoft.com/office/word/2010/wordprocessingDrawing" xmlns:wp="http://schemas.openxmlformats.org/drawingml/2006/wordprocessingDrawing" xmlns:w10="urn:schemas-microsoft-com:office:word" xmlns:w="http://schemas.openxmlformats.org/wordprocessingml/2006/main" xmlns:w14="http://schemas.microsoft.com/office/word/2010/wordml" xmlns:w15="http://schemas.microsoft.com/office/word/2012/wordml" xmlns:w16cex="http://schemas.microsoft.com/office/word/2018/wordml/cex" xmlns:w16cid="http://schemas.microsoft.com/office/word/2016/wordml/cid" xmlns:w16="http://schemas.microsoft.com/office/word/2018/wordml" xmlns:w16du="http://schemas.microsoft.com/office/word/2023/wordml/word16du" xmlns:w16sdtdh="http://schemas.microsoft.com/office/word/2020/wordml/sdtdatahash" xmlns:w16sdtfl="http://schemas.microsoft.com/office/word/2024/wordml/sdtformatlock" xmlns:w16se="http://schemas.microsoft.com/office/word/2015/wordml/symex" xmlns:wpg="http://schemas.microsoft.com/office/word/2010/wordprocessingGroup" xmlns:wpi="http://schemas.microsoft.com/office/word/2010/wordprocessingInk" xmlns:wne="http://schemas.microsoft.com/office/word/2006/wordml" xmlns:wps="http://schemas.microsoft.com/office/word/2010/wordprocessingShape" mc:Ignorable="w14 w15 w16se w16cid w16 w16cex w16sdtdh w16sdtfl w16du wp14">
+<w:document xmlns:wpc="http://schemas.microsoft.com/office/word/2010/wordprocessingCanvas" xmlns:cx="http://schemas.microsoft.com/office/drawing/2014/chartex" xmlns:cx1="http://schemas.microsoft.com/office/drawing/2015/9/8/chartex" xmlns:cx2="http://schemas.microsoft.com/office/drawing/2015/10/21/chartex" xmlns:cx3="http://schemas.microsoft.com/office/drawing/2016/5/9/chartex" xmlns:cx4="http://schemas.microsoft.com/office/drawing/2016/5/10/chartex" xmlns:cx5="http://schemas.microsoft.com/office/drawing/2016/5/11/chartex" xmlns:cx6="http://schemas.microsoft.com/office/drawing/2016/5/12/chartex" xmlns:cx7="http://schemas.microsoft.com/office/drawing/2016/5/13/chartex" xmlns:cx8="http://schemas.microsoft.com/office/drawing/2016/5/14/chartex" xmlns:mc="http://schemas.openxmlformats.org/markup-compatibility/2006" xmlns:aink="http://schemas.microsoft.com/office/drawing/2016/ink" xmlns:am3d="http://schemas.microsoft.com/office/drawing/2017/model3d" xmlns:o="urn:schemas-microsoft-com:office:office" xmlns:oel="http://schemas.microsoft.com/office/2019/extlst" xmlns:r="http://schemas.openxmlformats.org/officeDocument/2006/relationships" xmlns:m="http://schemas.openxmlformats.org/officeDocument/2006/math" xmlns:v="urn:schemas-microsoft-com:vml" xmlns:wp14="http://schemas.microsoft.com/office/word/2010/wordprocessingDrawing" xmlns:wp="http://schemas.openxmlformats.org/drawingml/2006/wordprocessingDrawing" xmlns:w10="urn:schemas-microsoft-com:office:word" xmlns:w="http://schemas.openxmlformats.org/wordprocessingml/2006/main" xmlns:w14="http://schemas.microsoft.com/office/word/2010/wordml" xmlns:w15="http://schemas.microsoft.com/office/word/2012/wordml" xmlns:w16cei="http://schemas.microsoft.com/office/word/2026/wordml/cei" xmlns:w16cex="http://schemas.microsoft.com/office/word/2018/wordml/cex" xmlns:w16cid="http://schemas.microsoft.com/office/word/2016/wordml/cid" xmlns:w16="http://schemas.microsoft.com/office/word/2018/wordml" xmlns:w16du="http://schemas.microsoft.com/office/word/2023/wordml/word16du" xmlns:w16sdtdh="http://schemas.microsoft.com/office/word/2020/wordml/sdtdatahash" xmlns:w16sdtfl="http://schemas.microsoft.com/office/word/2024/wordml/sdtformatlock" xmlns:w16se="http://schemas.microsoft.com/office/word/2015/wordml/symex" xmlns:wpg="http://schemas.microsoft.com/office/word/2010/wordprocessingGroup" xmlns:wpi="http://schemas.microsoft.com/office/word/2010/wordprocessingInk" xmlns:wne="http://schemas.microsoft.com/office/word/2006/wordml" xmlns:wps="http://schemas.microsoft.com/office/word/2010/wordprocessingShape" mc:Ignorable="w14 w15 w16se w16cid w16 w16cex w16sdtdh w16sdtfl w16du wp14">
   <w:body>
     <w:p>
       <w:pPr>
@@ -331,7 +331,7 @@
           </mc:Choice>
           <mc:Fallback>
             <w:pict>
-              <v:line w14:anchorId="4B8B11AB" id="Straight Connector 2" o:spid="_x0000_s1026" style="position:absolute;flip:y;z-index:251658240;visibility:visible;mso-wrap-style:square;mso-width-percent:0;mso-height-percent:0;mso-wrap-distance-left:9pt;mso-wrap-distance-top:0;mso-wrap-distance-right:9pt;mso-wrap-distance-bottom:0;mso-position-horizontal:absolute;mso-position-horizontal-relative:text;mso-position-vertical:absolute;mso-position-vertical-relative:text;mso-width-percent:0;mso-height-percent:0;mso-width-relative:margin;mso-height-relative:margin" from="0,4pt" to="450pt,4pt" o:gfxdata="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" strokecolor="black [3213]" strokeweight="1.5pt"/>
+              <v:line w14:anchorId="4B8B11AB" id="Straight Connector 2" o:spid="_x0000_s1026" style="position:absolute;flip:y;z-index:251658240;visibility:visible;mso-wrap-style:square;mso-width-percent:0;mso-height-percent:0;mso-wrap-distance-left:9pt;mso-wrap-distance-top:0;mso-wrap-distance-right:9pt;mso-wrap-distance-bottom:0;mso-position-horizontal:absolute;mso-position-horizontal-relative:text;mso-position-vertical:absolute;mso-position-vertical-relative:text;mso-width-percent:0;mso-height-percent:0;mso-width-relative:margin;mso-height-relative:margin" from="0,4pt" to="450pt,4pt" o:gfxdata="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" strokecolor="black [3213]" strokeweight="1.5pt"/>
             </w:pict>
           </mc:Fallback>
         </mc:AlternateContent>
@@ -573,19 +573,8 @@
                 <w:szCs w:val="44"/>
                 <w:lang w:val="en-IN"/>
               </w:rPr>
-              <w:t xml:space="preserve">Dr. Keyur </w:t>
+              <w:t>Dr. Keyur Brahmabhatt</w:t>
             </w:r>
-            <w:proofErr w:type="spellStart"/>
-            <w:r>
-              <w:rPr>
-                <w:rFonts w:ascii="Times New Roman" w:hAnsi="Times New Roman" w:cs="Times New Roman"/>
-                <w:sz w:val="28"/>
-                <w:szCs w:val="44"/>
-                <w:lang w:val="en-IN"/>
-              </w:rPr>
-              <w:t>Brahmabhatt</w:t>
-            </w:r>
-            <w:proofErr w:type="spellEnd"/>
           </w:p>
         </w:tc>
       </w:tr>
@@ -1195,110 +1184,110 @@
     </w:p>
     <w:p>
       <w:pPr>
+        <w:pStyle w:val="contentlist"/>
+      </w:pPr>
+      <w:r>
+        <w:t>User-friendly interface for game monitoring.</w:t>
+      </w:r>
+    </w:p>
+    <w:p>
+      <w:pPr>
+        <w:pStyle w:val="Heading2"/>
+      </w:pPr>
+      <w:bookmarkStart w:id="2" w:name="_Toc234858567"/>
+      <w:r>
+        <w:t>Scope of the System</w:t>
+      </w:r>
+      <w:bookmarkEnd w:id="2"/>
+    </w:p>
+    <w:p>
+      <w:pPr>
         <w:pStyle w:val="contentnormal"/>
       </w:pPr>
       <w:r>
-        <w:t>User-friendly interface for game monitoring.</w:t>
-      </w:r>
+        <w:t>The Chess Playing Robotic Arm System consists of a 6-DOF robotic arm, camera module, Raspberry Pi, Arduino Uno, and a chess engine. The system detects the current board state, calculates the best move, and physically moves the chess pieces.</w:t>
+      </w:r>
+    </w:p>
+    <w:p>
+      <w:pPr>
+        <w:pStyle w:val="contentnormal"/>
+      </w:pPr>
+      <w:r>
+        <w:t>Key feature</w:t>
+      </w:r>
+      <w:r>
+        <w:t>s</w:t>
+      </w:r>
+      <w:r>
+        <w:t xml:space="preserve"> include:</w:t>
+      </w:r>
+    </w:p>
+    <w:p>
+      <w:pPr>
+        <w:pStyle w:val="contentlist"/>
+      </w:pPr>
+      <w:r>
+        <w:t>Automatic chessboard recognition.</w:t>
+      </w:r>
+    </w:p>
+    <w:p>
+      <w:pPr>
+        <w:pStyle w:val="contentlist"/>
+      </w:pPr>
+      <w:r>
+        <w:t>Human move detection.</w:t>
+      </w:r>
+    </w:p>
+    <w:p>
+      <w:pPr>
+        <w:pStyle w:val="contentlist"/>
+      </w:pPr>
+      <w:r>
+        <w:t>AI-based move generation.</w:t>
+      </w:r>
+    </w:p>
+    <w:p>
+      <w:pPr>
+        <w:pStyle w:val="contentlist"/>
+      </w:pPr>
+      <w:r>
+        <w:t>Physical movement of chess pieces using a robotic arm.</w:t>
+      </w:r>
+    </w:p>
+    <w:p>
+      <w:pPr>
+        <w:pStyle w:val="contentlist"/>
+      </w:pPr>
+      <w:r>
+        <w:t>User interface for game control and monitoring.</w:t>
+      </w:r>
+    </w:p>
+    <w:p>
+      <w:pPr>
+        <w:pStyle w:val="Heading1"/>
+      </w:pPr>
+      <w:bookmarkStart w:id="3" w:name="_Toc234858568"/>
+      <w:r>
+        <w:t>General Description of the system</w:t>
+      </w:r>
+      <w:bookmarkEnd w:id="3"/>
     </w:p>
     <w:p>
       <w:pPr>
         <w:pStyle w:val="Heading2"/>
       </w:pPr>
-      <w:bookmarkStart w:id="2" w:name="_Toc234858567"/>
-      <w:r>
-        <w:t>Scope of the System</w:t>
-      </w:r>
-      <w:bookmarkEnd w:id="2"/>
+      <w:bookmarkStart w:id="4" w:name="_Toc234858569"/>
+      <w:r>
+        <w:t>Overall Description</w:t>
+      </w:r>
+      <w:bookmarkEnd w:id="4"/>
     </w:p>
     <w:p>
       <w:pPr>
         <w:pStyle w:val="contentnormal"/>
       </w:pPr>
       <w:r>
-        <w:t>The Chess Playing Robotic Arm System consists of a 6-DOF robotic arm, camera module, Raspberry Pi, Arduino Uno, and a chess engine. The system detects the current board state, calculates the best move, and physically moves the chess pieces.</w:t>
-      </w:r>
-    </w:p>
-    <w:p>
-      <w:pPr>
-        <w:pStyle w:val="contentnormal"/>
-      </w:pPr>
-      <w:r>
-        <w:t>Key feature</w:t>
-      </w:r>
-      <w:r>
-        <w:t>s</w:t>
-      </w:r>
-      <w:r>
-        <w:t xml:space="preserve"> include:</w:t>
-      </w:r>
-    </w:p>
-    <w:p>
-      <w:pPr>
-        <w:pStyle w:val="contentlist"/>
-      </w:pPr>
-      <w:r>
-        <w:t>Automatic chessboard recognition.</w:t>
-      </w:r>
-    </w:p>
-    <w:p>
-      <w:pPr>
-        <w:pStyle w:val="contentlist"/>
-      </w:pPr>
-      <w:r>
-        <w:t>Human move detection.</w:t>
-      </w:r>
-    </w:p>
-    <w:p>
-      <w:pPr>
-        <w:pStyle w:val="contentlist"/>
-      </w:pPr>
-      <w:r>
-        <w:t>AI-based move generation.</w:t>
-      </w:r>
-    </w:p>
-    <w:p>
-      <w:pPr>
-        <w:pStyle w:val="contentlist"/>
-      </w:pPr>
-      <w:r>
-        <w:t>Physical movement of chess pieces using a robotic arm.</w:t>
-      </w:r>
-    </w:p>
-    <w:p>
-      <w:pPr>
-        <w:pStyle w:val="contentlist"/>
-      </w:pPr>
-      <w:r>
-        <w:t>User interface for game control and monitoring.</w:t>
-      </w:r>
-    </w:p>
-    <w:p>
-      <w:pPr>
-        <w:pStyle w:val="Heading1"/>
-      </w:pPr>
-      <w:bookmarkStart w:id="3" w:name="_Toc234858568"/>
-      <w:r>
-        <w:t>General Description of the system</w:t>
-      </w:r>
-      <w:bookmarkEnd w:id="3"/>
-    </w:p>
-    <w:p>
-      <w:pPr>
-        <w:pStyle w:val="Heading2"/>
-      </w:pPr>
-      <w:bookmarkStart w:id="4" w:name="_Toc234858569"/>
-      <w:r>
-        <w:t>Overall Description</w:t>
-      </w:r>
-      <w:bookmarkEnd w:id="4"/>
-    </w:p>
-    <w:p>
-      <w:pPr>
-        <w:pStyle w:val="contentnormal"/>
-      </w:pPr>
-      <w:r>
-        <w:t>The system is an embedded robotic application that combines computer vision, artificial intelligence, and robotic manipulation. A camera continuously captures the chessboard image and processes it to identify piece positions. The chess engine computes the next move, and the robotic arm executes the move by controlling multiple servo motors.</w:t>
+        <w:t>The system is an embedded robotic application that combines computer vision, artificial intelligence, and robotic manipulation. A camera captures the chessboard image and processes it to identify piece positions. The chess engine computes the next move, and the robotic arm executes the move by controlling multiple servo motors.</w:t>
       </w:r>
     </w:p>
     <w:p>
@@ -1507,7 +1496,7 @@
                 <v:stroke joinstyle="miter"/>
                 <v:path gradientshapeok="t" o:connecttype="rect"/>
               </v:shapetype>
-              <v:shape id="Text Box 1" o:spid="_x0000_s1026" type="#_x0000_t202" style="position:absolute;left:0;text-align:left;margin-left:22.5pt;margin-top:267.9pt;width:396pt;height:17.9pt;z-index:251662336;visibility:visible;mso-wrap-style:square;mso-wrap-distance-left:9pt;mso-wrap-distance-top:0;mso-wrap-distance-right:9pt;mso-wrap-distance-bottom:0;mso-position-horizontal:absolute;mso-position-horizontal-relative:text;mso-position-vertical:absolute;mso-position-vertical-relative:text;v-text-anchor:top" o:gfxdata="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" stroked="f">
+              <v:shape id="Text Box 1" o:spid="_x0000_s1026" type="#_x0000_t202" style="position:absolute;left:0;text-align:left;margin-left:22.5pt;margin-top:267.9pt;width:396pt;height:17.9pt;z-index:251662336;visibility:visible;mso-wrap-style:square;mso-wrap-distance-left:9pt;mso-wrap-distance-top:0;mso-wrap-distance-right:9pt;mso-wrap-distance-bottom:0;mso-position-horizontal:absolute;mso-position-horizontal-relative:text;mso-position-vertical:absolute;mso-position-vertical-relative:text;v-text-anchor:top" o:gfxdata="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" stroked="f">
                 <v:textbox inset="0,0,0,0">
                   <w:txbxContent>
                     <w:p>
@@ -1714,7 +1703,7 @@
         <w:pStyle w:val="contentnormal"/>
       </w:pPr>
       <w:r>
-        <w:t>The Camera-Based Board Monitoring module is responsible for continuously observing the physical chessboard throughout the game. A top-mounted camera captures high-resolution images of the board after each player's move. Using image processing techniques with OpenCV, the module detects the chessboard boundaries, divides the board into 64 squares, and identifies the position of every chess piece. The captured board state is converted into a digital representation that is used by the remaining modules. Proper camera calibration and consistent lighting ensure accurate detection while minimizing recognition errors caused by shadows or reflections.</w:t>
+        <w:t>The Camera-Based Board Monitoring module is responsible for observing the physical chessboard throughout the game. A top-mounted camera captures high-resolution images of the board after each player's move. Using image processing techniques with OpenCV, the module detects the chessboard boundaries, divides the board into 64 squares, and identifies the position of every chess piece. The captured board state is converted into a digital representation that is used by the remaining modules. Proper camera calibration and consistent lighting ensure accurate detection while minimizing recognition errors caused by shadows or reflections.</w:t>
       </w:r>
     </w:p>
     <w:p>
@@ -1736,15 +1725,7 @@
         </w:rPr>
       </w:pPr>
       <w:r>
-        <w:t xml:space="preserve">The Move Detection module identifies the move made by the human player by comparing the current board state with the previous one. It analyzes the changes in the positions of chess pieces to determine the source and destination squares of the move. The detected move is then validated according to standard chess rules before being accepted. This module also recognizes special moves such as castling, pawn promotion, </w:t>
-      </w:r>
-      <w:proofErr w:type="spellStart"/>
-      <w:r>
-        <w:t>en</w:t>
-      </w:r>
-      <w:proofErr w:type="spellEnd"/>
-      <w:r>
-        <w:t xml:space="preserve"> passant captures, and piece captures. If an invalid move is detected, the system notifies the player and waits until a legal move is performed before proceeding</w:t>
+        <w:t>The Move Detection module identifies the move made by the human player by comparing the current board state with the previous one. It analyzes the changes in the positions of chess pieces to determine the source and destination squares of the move. The detected move is then validated according to standard chess rules before being accepted. This module also recognizes special moves such as castling, pawn promotion, en passant captures, and piece captures. If an invalid move is detected, the system notifies the player and waits until a legal move is performed before proceeding</w:t>
       </w:r>
       <w:r>
         <w:rPr>
@@ -2907,14 +2888,9 @@
       </w:pPr>
       <w:bookmarkStart w:id="21" w:name="_Toc234858586"/>
       <w:r>
-        <w:t xml:space="preserve">Table Name: </w:t>
-      </w:r>
-      <w:proofErr w:type="spellStart"/>
-      <w:r>
-        <w:t>user_table</w:t>
+        <w:t>Table Name: user_table</w:t>
       </w:r>
       <w:bookmarkEnd w:id="21"/>
-      <w:proofErr w:type="spellEnd"/>
     </w:p>
     <w:tbl>
       <w:tblPr>
@@ -3129,7 +3105,6 @@
                 <w:lang w:val="en-IN"/>
               </w:rPr>
             </w:pPr>
-            <w:proofErr w:type="spellStart"/>
             <w:r>
               <w:rPr>
                 <w:rFonts w:eastAsia="Calibri" w:cs="Times New Roman"/>
@@ -3139,7 +3114,6 @@
               </w:rPr>
               <w:t>user_id</w:t>
             </w:r>
-            <w:proofErr w:type="spellEnd"/>
           </w:p>
         </w:tc>
         <w:tc>
@@ -3192,19 +3166,8 @@
                 <w:szCs w:val="24"/>
                 <w:lang w:val="en-IN"/>
               </w:rPr>
-              <w:t xml:space="preserve">Primary key </w:t>
+              <w:t>Primary key auto_increment</w:t>
             </w:r>
-            <w:proofErr w:type="spellStart"/>
-            <w:r>
-              <w:rPr>
-                <w:rFonts w:eastAsia="Calibri" w:cs="Times New Roman"/>
-                <w:sz w:val="24"/>
-                <w:szCs w:val="24"/>
-                <w:lang w:val="en-IN"/>
-              </w:rPr>
-              <w:t>auto_increment</w:t>
-            </w:r>
-            <w:proofErr w:type="spellEnd"/>
           </w:p>
         </w:tc>
         <w:tc>
@@ -3302,23 +3265,13 @@
                 <w:szCs w:val="24"/>
               </w:rPr>
             </w:pPr>
-            <w:proofErr w:type="gramStart"/>
             <w:r>
               <w:rPr>
                 <w:rFonts w:cs="Times New Roman"/>
                 <w:sz w:val="24"/>
                 <w:szCs w:val="24"/>
               </w:rPr>
-              <w:t>PASSWORD(</w:t>
-            </w:r>
-            <w:proofErr w:type="gramEnd"/>
-            <w:r>
-              <w:rPr>
-                <w:rFonts w:cs="Times New Roman"/>
-                <w:sz w:val="24"/>
-                <w:szCs w:val="24"/>
-              </w:rPr>
-              <w:t>10)</w:t>
+              <w:t>PASSWORD(10)</w:t>
             </w:r>
           </w:p>
         </w:tc>
@@ -3438,23 +3391,13 @@
                 <w:szCs w:val="24"/>
               </w:rPr>
             </w:pPr>
-            <w:proofErr w:type="gramStart"/>
             <w:r>
               <w:rPr>
                 <w:rFonts w:cs="Times New Roman"/>
                 <w:sz w:val="24"/>
                 <w:szCs w:val="24"/>
               </w:rPr>
-              <w:t>VARCHAR(</w:t>
-            </w:r>
-            <w:proofErr w:type="gramEnd"/>
-            <w:r>
-              <w:rPr>
-                <w:rFonts w:cs="Times New Roman"/>
-                <w:sz w:val="24"/>
-                <w:szCs w:val="24"/>
-              </w:rPr>
-              <w:t>10)</w:t>
+              <w:t>VARCHAR(10)</w:t>
             </w:r>
           </w:p>
         </w:tc>
@@ -3574,23 +3517,13 @@
                 <w:szCs w:val="24"/>
               </w:rPr>
             </w:pPr>
-            <w:proofErr w:type="gramStart"/>
             <w:r>
               <w:rPr>
                 <w:rFonts w:cs="Times New Roman"/>
                 <w:sz w:val="24"/>
                 <w:szCs w:val="24"/>
               </w:rPr>
-              <w:t>VARCHAR(</w:t>
-            </w:r>
-            <w:proofErr w:type="gramEnd"/>
-            <w:r>
-              <w:rPr>
-                <w:rFonts w:cs="Times New Roman"/>
-                <w:sz w:val="24"/>
-                <w:szCs w:val="24"/>
-              </w:rPr>
-              <w:t>10)</w:t>
+              <w:t>VARCHAR(10)</w:t>
             </w:r>
           </w:p>
         </w:tc>
@@ -3633,23 +3566,13 @@
                 <w:szCs w:val="24"/>
               </w:rPr>
             </w:pPr>
-            <w:proofErr w:type="gramStart"/>
             <w:r>
               <w:rPr>
                 <w:rFonts w:cs="Times New Roman"/>
                 <w:sz w:val="24"/>
                 <w:szCs w:val="24"/>
               </w:rPr>
-              <w:t>User name</w:t>
-            </w:r>
-            <w:proofErr w:type="gramEnd"/>
-            <w:r>
-              <w:rPr>
-                <w:rFonts w:cs="Times New Roman"/>
-                <w:sz w:val="24"/>
-                <w:szCs w:val="24"/>
-              </w:rPr>
-              <w:t xml:space="preserve"> as player</w:t>
+              <w:t>User name as player</w:t>
             </w:r>
           </w:p>
         </w:tc>
@@ -3683,13 +3606,8 @@
         </w:r>
       </w:fldSimple>
       <w:r>
-        <w:t xml:space="preserve"> </w:t>
-      </w:r>
-      <w:proofErr w:type="spellStart"/>
-      <w:r>
-        <w:t>user_table</w:t>
-      </w:r>
-      <w:proofErr w:type="spellEnd"/>
+        <w:t xml:space="preserve"> user_table</w:t>
+      </w:r>
     </w:p>
     <w:p>
       <w:pPr>
@@ -3699,14 +3617,9 @@
         </w:rPr>
       </w:pPr>
       <w:r>
-        <w:t xml:space="preserve">Table Name: </w:t>
-      </w:r>
-      <w:proofErr w:type="spellStart"/>
-      <w:r>
-        <w:t>game_table</w:t>
+        <w:t>Table Name: game_table</w:t>
       </w:r>
       <w:bookmarkEnd w:id="22"/>
-      <w:proofErr w:type="spellEnd"/>
     </w:p>
     <w:tbl>
       <w:tblPr>
@@ -3921,7 +3834,6 @@
                 <w:lang w:val="en-IN"/>
               </w:rPr>
             </w:pPr>
-            <w:proofErr w:type="spellStart"/>
             <w:r>
               <w:rPr>
                 <w:rFonts w:eastAsia="Calibri" w:cs="Times New Roman"/>
@@ -3931,7 +3843,6 @@
               </w:rPr>
               <w:t>game_id</w:t>
             </w:r>
-            <w:proofErr w:type="spellEnd"/>
           </w:p>
         </w:tc>
         <w:tc>
@@ -3984,19 +3895,8 @@
                 <w:szCs w:val="24"/>
                 <w:lang w:val="en-IN"/>
               </w:rPr>
-              <w:t xml:space="preserve">Primary key </w:t>
+              <w:t>Primary key auto_increment</w:t>
             </w:r>
-            <w:proofErr w:type="spellStart"/>
-            <w:r>
-              <w:rPr>
-                <w:rFonts w:eastAsia="Calibri" w:cs="Times New Roman"/>
-                <w:sz w:val="24"/>
-                <w:szCs w:val="24"/>
-                <w:lang w:val="en-IN"/>
-              </w:rPr>
-              <w:t>auto_increment</w:t>
-            </w:r>
-            <w:proofErr w:type="spellEnd"/>
           </w:p>
         </w:tc>
         <w:tc>
@@ -4069,7 +3969,6 @@
                 <w:szCs w:val="24"/>
               </w:rPr>
             </w:pPr>
-            <w:proofErr w:type="spellStart"/>
             <w:r>
               <w:rPr>
                 <w:rFonts w:eastAsia="Calibri" w:cs="Times New Roman"/>
@@ -4079,7 +3978,6 @@
               </w:rPr>
               <w:t>user_id</w:t>
             </w:r>
-            <w:proofErr w:type="spellEnd"/>
           </w:p>
         </w:tc>
         <w:tc>
@@ -4198,7 +4096,6 @@
                 <w:szCs w:val="24"/>
               </w:rPr>
             </w:pPr>
-            <w:proofErr w:type="spellStart"/>
             <w:r>
               <w:rPr>
                 <w:rFonts w:cs="Times New Roman"/>
@@ -4207,7 +4104,6 @@
               </w:rPr>
               <w:t>start_time</w:t>
             </w:r>
-            <w:proofErr w:type="spellEnd"/>
           </w:p>
         </w:tc>
         <w:tc>
@@ -4326,7 +4222,6 @@
                 <w:szCs w:val="24"/>
               </w:rPr>
             </w:pPr>
-            <w:proofErr w:type="spellStart"/>
             <w:r>
               <w:rPr>
                 <w:rFonts w:cs="Times New Roman"/>
@@ -4335,7 +4230,6 @@
               </w:rPr>
               <w:t>end_time</w:t>
             </w:r>
-            <w:proofErr w:type="spellEnd"/>
           </w:p>
         </w:tc>
         <w:tc>
@@ -4604,23 +4498,13 @@
                 <w:szCs w:val="24"/>
               </w:rPr>
             </w:pPr>
-            <w:proofErr w:type="gramStart"/>
             <w:r>
               <w:rPr>
                 <w:rFonts w:cs="Times New Roman"/>
                 <w:sz w:val="24"/>
                 <w:szCs w:val="24"/>
               </w:rPr>
-              <w:t>VARCHAR(</w:t>
-            </w:r>
-            <w:proofErr w:type="gramEnd"/>
-            <w:r>
-              <w:rPr>
-                <w:rFonts w:cs="Times New Roman"/>
-                <w:sz w:val="24"/>
-                <w:szCs w:val="24"/>
-              </w:rPr>
-              <w:t>20)</w:t>
+              <w:t>VARCHAR(20)</w:t>
             </w:r>
           </w:p>
         </w:tc>
@@ -4703,13 +4587,8 @@
         </w:r>
       </w:fldSimple>
       <w:r>
-        <w:t xml:space="preserve"> </w:t>
-      </w:r>
-      <w:proofErr w:type="spellStart"/>
-      <w:r>
-        <w:t>game_table</w:t>
-      </w:r>
-      <w:proofErr w:type="spellEnd"/>
+        <w:t xml:space="preserve"> game_table</w:t>
+      </w:r>
     </w:p>
     <w:p>
       <w:pPr>
@@ -4719,14 +4598,9 @@
         </w:rPr>
       </w:pPr>
       <w:r>
-        <w:t xml:space="preserve">Table Name: </w:t>
-      </w:r>
-      <w:proofErr w:type="spellStart"/>
-      <w:r>
-        <w:t>move_table</w:t>
+        <w:t>Table Name: move_table</w:t>
       </w:r>
       <w:bookmarkEnd w:id="23"/>
-      <w:proofErr w:type="spellEnd"/>
     </w:p>
     <w:tbl>
       <w:tblPr>
@@ -4941,7 +4815,6 @@
                 <w:lang w:val="en-IN"/>
               </w:rPr>
             </w:pPr>
-            <w:proofErr w:type="spellStart"/>
             <w:r>
               <w:rPr>
                 <w:rFonts w:eastAsia="Calibri" w:cs="Times New Roman"/>
@@ -4950,7 +4823,6 @@
               </w:rPr>
               <w:t>move_id</w:t>
             </w:r>
-            <w:proofErr w:type="spellEnd"/>
           </w:p>
         </w:tc>
         <w:tc>
@@ -5003,19 +4875,8 @@
                 <w:szCs w:val="24"/>
                 <w:lang w:val="en-IN"/>
               </w:rPr>
-              <w:t xml:space="preserve">Primary key </w:t>
+              <w:t>Primary key auto_increment</w:t>
             </w:r>
-            <w:proofErr w:type="spellStart"/>
-            <w:r>
-              <w:rPr>
-                <w:rFonts w:eastAsia="Calibri" w:cs="Times New Roman"/>
-                <w:sz w:val="24"/>
-                <w:szCs w:val="24"/>
-                <w:lang w:val="en-IN"/>
-              </w:rPr>
-              <w:t>auto_increment</w:t>
-            </w:r>
-            <w:proofErr w:type="spellEnd"/>
           </w:p>
         </w:tc>
         <w:tc>
@@ -5088,7 +4949,6 @@
                 <w:szCs w:val="24"/>
               </w:rPr>
             </w:pPr>
-            <w:proofErr w:type="spellStart"/>
             <w:r>
               <w:rPr>
                 <w:rFonts w:cs="Times New Roman"/>
@@ -5097,7 +4957,6 @@
               </w:rPr>
               <w:t>game_id</w:t>
             </w:r>
-            <w:proofErr w:type="spellEnd"/>
           </w:p>
         </w:tc>
         <w:tc>
@@ -5216,7 +5075,6 @@
                 <w:szCs w:val="24"/>
               </w:rPr>
             </w:pPr>
-            <w:proofErr w:type="spellStart"/>
             <w:r>
               <w:rPr>
                 <w:rFonts w:cs="Times New Roman"/>
@@ -5225,7 +5083,6 @@
               </w:rPr>
               <w:t>move_number</w:t>
             </w:r>
-            <w:proofErr w:type="spellEnd"/>
           </w:p>
         </w:tc>
         <w:tc>
@@ -5368,23 +5225,13 @@
                 <w:szCs w:val="24"/>
               </w:rPr>
             </w:pPr>
-            <w:proofErr w:type="gramStart"/>
             <w:r>
               <w:rPr>
                 <w:rFonts w:cs="Times New Roman"/>
                 <w:sz w:val="24"/>
                 <w:szCs w:val="24"/>
               </w:rPr>
-              <w:t>VARCHAR(</w:t>
-            </w:r>
-            <w:proofErr w:type="gramEnd"/>
-            <w:r>
-              <w:rPr>
-                <w:rFonts w:cs="Times New Roman"/>
-                <w:sz w:val="24"/>
-                <w:szCs w:val="24"/>
-              </w:rPr>
-              <w:t>20)</w:t>
+              <w:t>VARCHAR(20)</w:t>
             </w:r>
           </w:p>
         </w:tc>
@@ -5504,23 +5351,13 @@
                 <w:szCs w:val="24"/>
               </w:rPr>
             </w:pPr>
-            <w:proofErr w:type="gramStart"/>
             <w:r>
               <w:rPr>
                 <w:rFonts w:cs="Times New Roman"/>
                 <w:sz w:val="24"/>
                 <w:szCs w:val="24"/>
               </w:rPr>
-              <w:t>VARCHAR(</w:t>
-            </w:r>
-            <w:proofErr w:type="gramEnd"/>
-            <w:r>
-              <w:rPr>
-                <w:rFonts w:cs="Times New Roman"/>
-                <w:sz w:val="24"/>
-                <w:szCs w:val="24"/>
-              </w:rPr>
-              <w:t>20)</w:t>
+              <w:t>VARCHAR(20)</w:t>
             </w:r>
           </w:p>
         </w:tc>
@@ -5606,14 +5443,9 @@
       <w:bookmarkStart w:id="24" w:name="_Toc234858589"/>
       <w:r>
         <w:lastRenderedPageBreak/>
-        <w:t xml:space="preserve">Table Name: </w:t>
-      </w:r>
-      <w:proofErr w:type="spellStart"/>
-      <w:r>
-        <w:t>motor_log</w:t>
+        <w:t>Table Name: motor_log</w:t>
       </w:r>
       <w:bookmarkEnd w:id="24"/>
-      <w:proofErr w:type="spellEnd"/>
     </w:p>
     <w:tbl>
       <w:tblPr>
@@ -5828,7 +5660,6 @@
                 <w:lang w:val="en-IN"/>
               </w:rPr>
             </w:pPr>
-            <w:proofErr w:type="spellStart"/>
             <w:r>
               <w:rPr>
                 <w:rFonts w:eastAsia="Calibri" w:cs="Times New Roman"/>
@@ -5838,7 +5669,6 @@
               </w:rPr>
               <w:t>log_id</w:t>
             </w:r>
-            <w:proofErr w:type="spellEnd"/>
           </w:p>
         </w:tc>
         <w:tc>
@@ -5891,19 +5721,8 @@
                 <w:szCs w:val="24"/>
                 <w:lang w:val="en-IN"/>
               </w:rPr>
-              <w:t xml:space="preserve">Primary key </w:t>
+              <w:t>Primary key auto_increment</w:t>
             </w:r>
-            <w:proofErr w:type="spellStart"/>
-            <w:r>
-              <w:rPr>
-                <w:rFonts w:eastAsia="Calibri" w:cs="Times New Roman"/>
-                <w:sz w:val="24"/>
-                <w:szCs w:val="24"/>
-                <w:lang w:val="en-IN"/>
-              </w:rPr>
-              <w:t>auto_increment</w:t>
-            </w:r>
-            <w:proofErr w:type="spellEnd"/>
           </w:p>
         </w:tc>
         <w:tc>
@@ -5976,7 +5795,6 @@
                 <w:szCs w:val="24"/>
               </w:rPr>
             </w:pPr>
-            <w:proofErr w:type="spellStart"/>
             <w:r>
               <w:rPr>
                 <w:rFonts w:cs="Times New Roman"/>
@@ -5985,7 +5803,6 @@
               </w:rPr>
               <w:t>motor_id</w:t>
             </w:r>
-            <w:proofErr w:type="spellEnd"/>
           </w:p>
         </w:tc>
         <w:tc>
@@ -6380,23 +6197,13 @@
                 <w:szCs w:val="24"/>
               </w:rPr>
             </w:pPr>
-            <w:proofErr w:type="gramStart"/>
             <w:r>
               <w:rPr>
                 <w:rFonts w:cs="Times New Roman"/>
                 <w:sz w:val="24"/>
                 <w:szCs w:val="24"/>
               </w:rPr>
-              <w:t>VARCHAR(</w:t>
-            </w:r>
-            <w:proofErr w:type="gramEnd"/>
-            <w:r>
-              <w:rPr>
-                <w:rFonts w:cs="Times New Roman"/>
-                <w:sz w:val="24"/>
-                <w:szCs w:val="24"/>
-              </w:rPr>
-              <w:t>20)</w:t>
+              <w:t>VARCHAR(20)</w:t>
             </w:r>
           </w:p>
         </w:tc>
@@ -6498,7 +6305,7 @@
 </file>
 
 <file path=word/endnotes.xml><?xml version="1.0" encoding="utf-8"?>
-<w:endnotes xmlns:wpc="http://schemas.microsoft.com/office/word/2010/wordprocessingCanvas" xmlns:cx="http://schemas.microsoft.com/office/drawing/2014/chartex" xmlns:cx1="http://schemas.microsoft.com/office/drawing/2015/9/8/chartex" xmlns:cx2="http://schemas.microsoft.com/office/drawing/2015/10/21/chartex" xmlns:cx3="http://schemas.microsoft.com/office/drawing/2016/5/9/chartex" xmlns:cx4="http://schemas.microsoft.com/office/drawing/2016/5/10/chartex" xmlns:cx5="http://schemas.microsoft.com/office/drawing/2016/5/11/chartex" xmlns:cx6="http://schemas.microsoft.com/office/drawing/2016/5/12/chartex" xmlns:cx7="http://schemas.microsoft.com/office/drawing/2016/5/13/chartex" xmlns:cx8="http://schemas.microsoft.com/office/drawing/2016/5/14/chartex" xmlns:mc="http://schemas.openxmlformats.org/markup-compatibility/2006" xmlns:aink="http://schemas.microsoft.com/office/drawing/2016/ink" xmlns:am3d="http://schemas.microsoft.com/office/drawing/2017/model3d" xmlns:o="urn:schemas-microsoft-com:office:office" xmlns:oel="http://schemas.microsoft.com/office/2019/extlst" xmlns:r="http://schemas.openxmlformats.org/officeDocument/2006/relationships" xmlns:m="http://schemas.openxmlformats.org/officeDocument/2006/math" xmlns:v="urn:schemas-microsoft-com:vml" xmlns:wp14="http://schemas.microsoft.com/office/word/2010/wordprocessingDrawing" xmlns:wp="http://schemas.openxmlformats.org/drawingml/2006/wordprocessingDrawing" xmlns:w10="urn:schemas-microsoft-com:office:word" xmlns:w="http://schemas.openxmlformats.org/wordprocessingml/2006/main" xmlns:w14="http://schemas.microsoft.com/office/word/2010/wordml" xmlns:w15="http://schemas.microsoft.com/office/word/2012/wordml" xmlns:w16cex="http://schemas.microsoft.com/office/word/2018/wordml/cex" xmlns:w16cid="http://schemas.microsoft.com/office/word/2016/wordml/cid" xmlns:w16="http://schemas.microsoft.com/office/word/2018/wordml" xmlns:w16du="http://schemas.microsoft.com/office/word/2023/wordml/word16du" xmlns:w16sdtdh="http://schemas.microsoft.com/office/word/2020/wordml/sdtdatahash" xmlns:w16sdtfl="http://schemas.microsoft.com/office/word/2024/wordml/sdtformatlock" xmlns:w16se="http://schemas.microsoft.com/office/word/2015/wordml/symex" xmlns:wpg="http://schemas.microsoft.com/office/word/2010/wordprocessingGroup" xmlns:wpi="http://schemas.microsoft.com/office/word/2010/wordprocessingInk" xmlns:wne="http://schemas.microsoft.com/office/word/2006/wordml" xmlns:wps="http://schemas.microsoft.com/office/word/2010/wordprocessingShape" mc:Ignorable="w14 w15 w16se w16cid w16 w16cex w16sdtdh w16sdtfl w16du wp14">
+<w:endnotes xmlns:wpc="http://schemas.microsoft.com/office/word/2010/wordprocessingCanvas" xmlns:cx="http://schemas.microsoft.com/office/drawing/2014/chartex" xmlns:cx1="http://schemas.microsoft.com/office/drawing/2015/9/8/chartex" xmlns:cx2="http://schemas.microsoft.com/office/drawing/2015/10/21/chartex" xmlns:cx3="http://schemas.microsoft.com/office/drawing/2016/5/9/chartex" xmlns:cx4="http://schemas.microsoft.com/office/drawing/2016/5/10/chartex" xmlns:cx5="http://schemas.microsoft.com/office/drawing/2016/5/11/chartex" xmlns:cx6="http://schemas.microsoft.com/office/drawing/2016/5/12/chartex" xmlns:cx7="http://schemas.microsoft.com/office/drawing/2016/5/13/chartex" xmlns:cx8="http://schemas.microsoft.com/office/drawing/2016/5/14/chartex" xmlns:mc="http://schemas.openxmlformats.org/markup-compatibility/2006" xmlns:aink="http://schemas.microsoft.com/office/drawing/2016/ink" xmlns:am3d="http://schemas.microsoft.com/office/drawing/2017/model3d" xmlns:o="urn:schemas-microsoft-com:office:office" xmlns:oel="http://schemas.microsoft.com/office/2019/extlst" xmlns:r="http://schemas.openxmlformats.org/officeDocument/2006/relationships" xmlns:m="http://schemas.openxmlformats.org/officeDocument/2006/math" xmlns:v="urn:schemas-microsoft-com:vml" xmlns:wp14="http://schemas.microsoft.com/office/word/2010/wordprocessingDrawing" xmlns:wp="http://schemas.openxmlformats.org/drawingml/2006/wordprocessingDrawing" xmlns:w10="urn:schemas-microsoft-com:office:word" xmlns:w="http://schemas.openxmlformats.org/wordprocessingml/2006/main" xmlns:w14="http://schemas.microsoft.com/office/word/2010/wordml" xmlns:w15="http://schemas.microsoft.com/office/word/2012/wordml" xmlns:w16cei="http://schemas.microsoft.com/office/word/2026/wordml/cei" xmlns:w16cex="http://schemas.microsoft.com/office/word/2018/wordml/cex" xmlns:w16cid="http://schemas.microsoft.com/office/word/2016/wordml/cid" xmlns:w16="http://schemas.microsoft.com/office/word/2018/wordml" xmlns:w16du="http://schemas.microsoft.com/office/word/2023/wordml/word16du" xmlns:w16sdtdh="http://schemas.microsoft.com/office/word/2020/wordml/sdtdatahash" xmlns:w16sdtfl="http://schemas.microsoft.com/office/word/2024/wordml/sdtformatlock" xmlns:w16se="http://schemas.microsoft.com/office/word/2015/wordml/symex" xmlns:wpg="http://schemas.microsoft.com/office/word/2010/wordprocessingGroup" xmlns:wpi="http://schemas.microsoft.com/office/word/2010/wordprocessingInk" xmlns:wne="http://schemas.microsoft.com/office/word/2006/wordml" xmlns:wps="http://schemas.microsoft.com/office/word/2010/wordprocessingShape" mc:Ignorable="w14 w15 w16se w16cid w16 w16cex w16sdtdh w16sdtfl w16du wp14">
   <w:endnote w:type="separator" w:id="-1">
     <w:p>
       <w:pPr>
@@ -6523,7 +6330,7 @@
 </file>
 
 <file path=word/footer1.xml><?xml version="1.0" encoding="utf-8"?>
-<w:ftr xmlns:wpc="http://schemas.microsoft.com/office/word/2010/wordprocessingCanvas" xmlns:cx="http://schemas.microsoft.com/office/drawing/2014/chartex" xmlns:cx1="http://schemas.microsoft.com/office/drawing/2015/9/8/chartex" xmlns:cx2="http://schemas.microsoft.com/office/drawing/2015/10/21/chartex" xmlns:cx3="http://schemas.microsoft.com/office/drawing/2016/5/9/chartex" xmlns:cx4="http://schemas.microsoft.com/office/drawing/2016/5/10/chartex" xmlns:cx5="http://schemas.microsoft.com/office/drawing/2016/5/11/chartex" xmlns:cx6="http://schemas.microsoft.com/office/drawing/2016/5/12/chartex" xmlns:cx7="http://schemas.microsoft.com/office/drawing/2016/5/13/chartex" xmlns:cx8="http://schemas.microsoft.com/office/drawing/2016/5/14/chartex" xmlns:mc="http://schemas.openxmlformats.org/markup-compatibility/2006" xmlns:aink="http://schemas.microsoft.com/office/drawing/2016/ink" xmlns:am3d="http://schemas.microsoft.com/office/drawing/2017/model3d" xmlns:o="urn:schemas-microsoft-com:office:office" xmlns:oel="http://schemas.microsoft.com/office/2019/extlst" xmlns:r="http://schemas.openxmlformats.org/officeDocument/2006/relationships" xmlns:m="http://schemas.openxmlformats.org/officeDocument/2006/math" xmlns:v="urn:schemas-microsoft-com:vml" xmlns:wp14="http://schemas.microsoft.com/office/word/2010/wordprocessingDrawing" xmlns:wp="http://schemas.openxmlformats.org/drawingml/2006/wordprocessingDrawing" xmlns:w10="urn:schemas-microsoft-com:office:word" xmlns:w="http://schemas.openxmlformats.org/wordprocessingml/2006/main" xmlns:w14="http://schemas.microsoft.com/office/word/2010/wordml" xmlns:w15="http://schemas.microsoft.com/office/word/2012/wordml" xmlns:w16cex="http://schemas.microsoft.com/office/word/2018/wordml/cex" xmlns:w16cid="http://schemas.microsoft.com/office/word/2016/wordml/cid" xmlns:w16="http://schemas.microsoft.com/office/word/2018/wordml" xmlns:w16du="http://schemas.microsoft.com/office/word/2023/wordml/word16du" xmlns:w16sdtdh="http://schemas.microsoft.com/office/word/2020/wordml/sdtdatahash" xmlns:w16sdtfl="http://schemas.microsoft.com/office/word/2024/wordml/sdtformatlock" xmlns:w16se="http://schemas.microsoft.com/office/word/2015/wordml/symex" xmlns:wpg="http://schemas.microsoft.com/office/word/2010/wordprocessingGroup" xmlns:wpi="http://schemas.microsoft.com/office/word/2010/wordprocessingInk" xmlns:wne="http://schemas.microsoft.com/office/word/2006/wordml" xmlns:wps="http://schemas.microsoft.com/office/word/2010/wordprocessingShape" mc:Ignorable="w14 w15 w16se w16cid w16 w16cex w16sdtdh w16sdtfl w16du wp14">
+<w:ftr xmlns:wpc="http://schemas.microsoft.com/office/word/2010/wordprocessingCanvas" xmlns:cx="http://schemas.microsoft.com/office/drawing/2014/chartex" xmlns:cx1="http://schemas.microsoft.com/office/drawing/2015/9/8/chartex" xmlns:cx2="http://schemas.microsoft.com/office/drawing/2015/10/21/chartex" xmlns:cx3="http://schemas.microsoft.com/office/drawing/2016/5/9/chartex" xmlns:cx4="http://schemas.microsoft.com/office/drawing/2016/5/10/chartex" xmlns:cx5="http://schemas.microsoft.com/office/drawing/2016/5/11/chartex" xmlns:cx6="http://schemas.microsoft.com/office/drawing/2016/5/12/chartex" xmlns:cx7="http://schemas.microsoft.com/office/drawing/2016/5/13/chartex" xmlns:cx8="http://schemas.microsoft.com/office/drawing/2016/5/14/chartex" xmlns:mc="http://schemas.openxmlformats.org/markup-compatibility/2006" xmlns:aink="http://schemas.microsoft.com/office/drawing/2016/ink" xmlns:am3d="http://schemas.microsoft.com/office/drawing/2017/model3d" xmlns:o="urn:schemas-microsoft-com:office:office" xmlns:oel="http://schemas.microsoft.com/office/2019/extlst" xmlns:r="http://schemas.openxmlformats.org/officeDocument/2006/relationships" xmlns:m="http://schemas.openxmlformats.org/officeDocument/2006/math" xmlns:v="urn:schemas-microsoft-com:vml" xmlns:wp14="http://schemas.microsoft.com/office/word/2010/wordprocessingDrawing" xmlns:wp="http://schemas.openxmlformats.org/drawingml/2006/wordprocessingDrawing" xmlns:w10="urn:schemas-microsoft-com:office:word" xmlns:w="http://schemas.openxmlformats.org/wordprocessingml/2006/main" xmlns:w14="http://schemas.microsoft.com/office/word/2010/wordml" xmlns:w15="http://schemas.microsoft.com/office/word/2012/wordml" xmlns:w16cei="http://schemas.microsoft.com/office/word/2026/wordml/cei" xmlns:w16cex="http://schemas.microsoft.com/office/word/2018/wordml/cex" xmlns:w16cid="http://schemas.microsoft.com/office/word/2016/wordml/cid" xmlns:w16="http://schemas.microsoft.com/office/word/2018/wordml" xmlns:w16du="http://schemas.microsoft.com/office/word/2023/wordml/word16du" xmlns:w16sdtdh="http://schemas.microsoft.com/office/word/2020/wordml/sdtdatahash" xmlns:w16sdtfl="http://schemas.microsoft.com/office/word/2024/wordml/sdtformatlock" xmlns:w16se="http://schemas.microsoft.com/office/word/2015/wordml/symex" xmlns:wpg="http://schemas.microsoft.com/office/word/2010/wordprocessingGroup" xmlns:wpi="http://schemas.microsoft.com/office/word/2010/wordprocessingInk" xmlns:wne="http://schemas.microsoft.com/office/word/2006/wordml" xmlns:wps="http://schemas.microsoft.com/office/word/2010/wordprocessingShape" mc:Ignorable="w14 w15 w16se w16cid w16 w16cex w16sdtdh w16sdtfl w16du wp14">
   <w:p>
     <w:pPr>
       <w:pStyle w:val="Footer"/>
@@ -6533,7 +6340,7 @@
 </file>
 
 <file path=word/footer2.xml><?xml version="1.0" encoding="utf-8"?>
-<w:ftr xmlns:wpc="http://schemas.microsoft.com/office/word/2010/wordprocessingCanvas" xmlns:cx="http://schemas.microsoft.com/office/drawing/2014/chartex" xmlns:cx1="http://schemas.microsoft.com/office/drawing/2015/9/8/chartex" xmlns:cx2="http://schemas.microsoft.com/office/drawing/2015/10/21/chartex" xmlns:cx3="http://schemas.microsoft.com/office/drawing/2016/5/9/chartex" xmlns:cx4="http://schemas.microsoft.com/office/drawing/2016/5/10/chartex" xmlns:cx5="http://schemas.microsoft.com/office/drawing/2016/5/11/chartex" xmlns:cx6="http://schemas.microsoft.com/office/drawing/2016/5/12/chartex" xmlns:cx7="http://schemas.microsoft.com/office/drawing/2016/5/13/chartex" xmlns:cx8="http://schemas.microsoft.com/office/drawing/2016/5/14/chartex" xmlns:mc="http://schemas.openxmlformats.org/markup-compatibility/2006" xmlns:aink="http://schemas.microsoft.com/office/drawing/2016/ink" xmlns:am3d="http://schemas.microsoft.com/office/drawing/2017/model3d" xmlns:o="urn:schemas-microsoft-com:office:office" xmlns:oel="http://schemas.microsoft.com/office/2019/extlst" xmlns:r="http://schemas.openxmlformats.org/officeDocument/2006/relationships" xmlns:m="http://schemas.openxmlformats.org/officeDocument/2006/math" xmlns:v="urn:schemas-microsoft-com:vml" xmlns:wp14="http://schemas.microsoft.com/office/word/2010/wordprocessingDrawing" xmlns:wp="http://schemas.openxmlformats.org/drawingml/2006/wordprocessingDrawing" xmlns:w10="urn:schemas-microsoft-com:office:word" xmlns:w="http://schemas.openxmlformats.org/wordprocessingml/2006/main" xmlns:w14="http://schemas.microsoft.com/office/word/2010/wordml" xmlns:w15="http://schemas.microsoft.com/office/word/2012/wordml" xmlns:w16cex="http://schemas.microsoft.com/office/word/2018/wordml/cex" xmlns:w16cid="http://schemas.microsoft.com/office/word/2016/wordml/cid" xmlns:w16="http://schemas.microsoft.com/office/word/2018/wordml" xmlns:w16du="http://schemas.microsoft.com/office/word/2023/wordml/word16du" xmlns:w16sdtdh="http://schemas.microsoft.com/office/word/2020/wordml/sdtdatahash" xmlns:w16sdtfl="http://schemas.microsoft.com/office/word/2024/wordml/sdtformatlock" xmlns:w16se="http://schemas.microsoft.com/office/word/2015/wordml/symex" xmlns:wpg="http://schemas.microsoft.com/office/word/2010/wordprocessingGroup" xmlns:wpi="http://schemas.microsoft.com/office/word/2010/wordprocessingInk" xmlns:wne="http://schemas.microsoft.com/office/word/2006/wordml" xmlns:wps="http://schemas.microsoft.com/office/word/2010/wordprocessingShape" mc:Ignorable="w14 w15 w16se w16cid w16 w16cex w16sdtdh w16sdtfl w16du wp14">
+<w:ftr xmlns:wpc="http://schemas.microsoft.com/office/word/2010/wordprocessingCanvas" xmlns:cx="http://schemas.microsoft.com/office/drawing/2014/chartex" xmlns:cx1="http://schemas.microsoft.com/office/drawing/2015/9/8/chartex" xmlns:cx2="http://schemas.microsoft.com/office/drawing/2015/10/21/chartex" xmlns:cx3="http://schemas.microsoft.com/office/drawing/2016/5/9/chartex" xmlns:cx4="http://schemas.microsoft.com/office/drawing/2016/5/10/chartex" xmlns:cx5="http://schemas.microsoft.com/office/drawing/2016/5/11/chartex" xmlns:cx6="http://schemas.microsoft.com/office/drawing/2016/5/12/chartex" xmlns:cx7="http://schemas.microsoft.com/office/drawing/2016/5/13/chartex" xmlns:cx8="http://schemas.microsoft.com/office/drawing/2016/5/14/chartex" xmlns:mc="http://schemas.openxmlformats.org/markup-compatibility/2006" xmlns:aink="http://schemas.microsoft.com/office/drawing/2016/ink" xmlns:am3d="http://schemas.microsoft.com/office/drawing/2017/model3d" xmlns:o="urn:schemas-microsoft-com:office:office" xmlns:oel="http://schemas.microsoft.com/office/2019/extlst" xmlns:r="http://schemas.openxmlformats.org/officeDocument/2006/relationships" xmlns:m="http://schemas.openxmlformats.org/officeDocument/2006/math" xmlns:v="urn:schemas-microsoft-com:vml" xmlns:wp14="http://schemas.microsoft.com/office/word/2010/wordprocessingDrawing" xmlns:wp="http://schemas.openxmlformats.org/drawingml/2006/wordprocessingDrawing" xmlns:w10="urn:schemas-microsoft-com:office:word" xmlns:w="http://schemas.openxmlformats.org/wordprocessingml/2006/main" xmlns:w14="http://schemas.microsoft.com/office/word/2010/wordml" xmlns:w15="http://schemas.microsoft.com/office/word/2012/wordml" xmlns:w16cei="http://schemas.microsoft.com/office/word/2026/wordml/cei" xmlns:w16cex="http://schemas.microsoft.com/office/word/2018/wordml/cex" xmlns:w16cid="http://schemas.microsoft.com/office/word/2016/wordml/cid" xmlns:w16="http://schemas.microsoft.com/office/word/2018/wordml" xmlns:w16du="http://schemas.microsoft.com/office/word/2023/wordml/word16du" xmlns:w16sdtdh="http://schemas.microsoft.com/office/word/2020/wordml/sdtdatahash" xmlns:w16sdtfl="http://schemas.microsoft.com/office/word/2024/wordml/sdtformatlock" xmlns:w16se="http://schemas.microsoft.com/office/word/2015/wordml/symex" xmlns:wpg="http://schemas.microsoft.com/office/word/2010/wordprocessingGroup" xmlns:wpi="http://schemas.microsoft.com/office/word/2010/wordprocessingInk" xmlns:wne="http://schemas.microsoft.com/office/word/2006/wordml" xmlns:wps="http://schemas.microsoft.com/office/word/2010/wordprocessingShape" mc:Ignorable="w14 w15 w16se w16cid w16 w16cex w16sdtdh w16sdtfl w16du wp14">
   <w:sdt>
     <w:sdtPr>
       <w:rPr>
@@ -6633,7 +6440,7 @@
 </file>
 
 <file path=word/footer3.xml><?xml version="1.0" encoding="utf-8"?>
-<w:ftr xmlns:wpc="http://schemas.microsoft.com/office/word/2010/wordprocessingCanvas" xmlns:cx="http://schemas.microsoft.com/office/drawing/2014/chartex" xmlns:cx1="http://schemas.microsoft.com/office/drawing/2015/9/8/chartex" xmlns:cx2="http://schemas.microsoft.com/office/drawing/2015/10/21/chartex" xmlns:cx3="http://schemas.microsoft.com/office/drawing/2016/5/9/chartex" xmlns:cx4="http://schemas.microsoft.com/office/drawing/2016/5/10/chartex" xmlns:cx5="http://schemas.microsoft.com/office/drawing/2016/5/11/chartex" xmlns:cx6="http://schemas.microsoft.com/office/drawing/2016/5/12/chartex" xmlns:cx7="http://schemas.microsoft.com/office/drawing/2016/5/13/chartex" xmlns:cx8="http://schemas.microsoft.com/office/drawing/2016/5/14/chartex" xmlns:mc="http://schemas.openxmlformats.org/markup-compatibility/2006" xmlns:aink="http://schemas.microsoft.com/office/drawing/2016/ink" xmlns:am3d="http://schemas.microsoft.com/office/drawing/2017/model3d" xmlns:o="urn:schemas-microsoft-com:office:office" xmlns:oel="http://schemas.microsoft.com/office/2019/extlst" xmlns:r="http://schemas.openxmlformats.org/officeDocument/2006/relationships" xmlns:m="http://schemas.openxmlformats.org/officeDocument/2006/math" xmlns:v="urn:schemas-microsoft-com:vml" xmlns:wp14="http://schemas.microsoft.com/office/word/2010/wordprocessingDrawing" xmlns:wp="http://schemas.openxmlformats.org/drawingml/2006/wordprocessingDrawing" xmlns:w10="urn:schemas-microsoft-com:office:word" xmlns:w="http://schemas.openxmlformats.org/wordprocessingml/2006/main" xmlns:w14="http://schemas.microsoft.com/office/word/2010/wordml" xmlns:w15="http://schemas.microsoft.com/office/word/2012/wordml" xmlns:w16cex="http://schemas.microsoft.com/office/word/2018/wordml/cex" xmlns:w16cid="http://schemas.microsoft.com/office/word/2016/wordml/cid" xmlns:w16="http://schemas.microsoft.com/office/word/2018/wordml" xmlns:w16du="http://schemas.microsoft.com/office/word/2023/wordml/word16du" xmlns:w16sdtdh="http://schemas.microsoft.com/office/word/2020/wordml/sdtdatahash" xmlns:w16sdtfl="http://schemas.microsoft.com/office/word/2024/wordml/sdtformatlock" xmlns:w16se="http://schemas.microsoft.com/office/word/2015/wordml/symex" xmlns:wpg="http://schemas.microsoft.com/office/word/2010/wordprocessingGroup" xmlns:wpi="http://schemas.microsoft.com/office/word/2010/wordprocessingInk" xmlns:wne="http://schemas.microsoft.com/office/word/2006/wordml" xmlns:wps="http://schemas.microsoft.com/office/word/2010/wordprocessingShape" mc:Ignorable="w14 w15 w16se w16cid w16 w16cex w16sdtdh w16sdtfl w16du wp14">
+<w:ftr xmlns:wpc="http://schemas.microsoft.com/office/word/2010/wordprocessingCanvas" xmlns:cx="http://schemas.microsoft.com/office/drawing/2014/chartex" xmlns:cx1="http://schemas.microsoft.com/office/drawing/2015/9/8/chartex" xmlns:cx2="http://schemas.microsoft.com/office/drawing/2015/10/21/chartex" xmlns:cx3="http://schemas.microsoft.com/office/drawing/2016/5/9/chartex" xmlns:cx4="http://schemas.microsoft.com/office/drawing/2016/5/10/chartex" xmlns:cx5="http://schemas.microsoft.com/office/drawing/2016/5/11/chartex" xmlns:cx6="http://schemas.microsoft.com/office/drawing/2016/5/12/chartex" xmlns:cx7="http://schemas.microsoft.com/office/drawing/2016/5/13/chartex" xmlns:cx8="http://schemas.microsoft.com/office/drawing/2016/5/14/chartex" xmlns:mc="http://schemas.openxmlformats.org/markup-compatibility/2006" xmlns:aink="http://schemas.microsoft.com/office/drawing/2016/ink" xmlns:am3d="http://schemas.microsoft.com/office/drawing/2017/model3d" xmlns:o="urn:schemas-microsoft-com:office:office" xmlns:oel="http://schemas.microsoft.com/office/2019/extlst" xmlns:r="http://schemas.openxmlformats.org/officeDocument/2006/relationships" xmlns:m="http://schemas.openxmlformats.org/officeDocument/2006/math" xmlns:v="urn:schemas-microsoft-com:vml" xmlns:wp14="http://schemas.microsoft.com/office/word/2010/wordprocessingDrawing" xmlns:wp="http://schemas.openxmlformats.org/drawingml/2006/wordprocessingDrawing" xmlns:w10="urn:schemas-microsoft-com:office:word" xmlns:w="http://schemas.openxmlformats.org/wordprocessingml/2006/main" xmlns:w14="http://schemas.microsoft.com/office/word/2010/wordml" xmlns:w15="http://schemas.microsoft.com/office/word/2012/wordml" xmlns:w16cei="http://schemas.microsoft.com/office/word/2026/wordml/cei" xmlns:w16cex="http://schemas.microsoft.com/office/word/2018/wordml/cex" xmlns:w16cid="http://schemas.microsoft.com/office/word/2016/wordml/cid" xmlns:w16="http://schemas.microsoft.com/office/word/2018/wordml" xmlns:w16du="http://schemas.microsoft.com/office/word/2023/wordml/word16du" xmlns:w16sdtdh="http://schemas.microsoft.com/office/word/2020/wordml/sdtdatahash" xmlns:w16sdtfl="http://schemas.microsoft.com/office/word/2024/wordml/sdtformatlock" xmlns:w16se="http://schemas.microsoft.com/office/word/2015/wordml/symex" xmlns:wpg="http://schemas.microsoft.com/office/word/2010/wordprocessingGroup" xmlns:wpi="http://schemas.microsoft.com/office/word/2010/wordprocessingInk" xmlns:wne="http://schemas.microsoft.com/office/word/2006/wordml" xmlns:wps="http://schemas.microsoft.com/office/word/2010/wordprocessingShape" mc:Ignorable="w14 w15 w16se w16cid w16 w16cex w16sdtdh w16sdtfl w16du wp14">
   <w:p>
     <w:pPr>
       <w:pStyle w:val="Footer"/>
@@ -6643,7 +6450,7 @@
 </file>
 
 <file path=word/footnotes.xml><?xml version="1.0" encoding="utf-8"?>
-<w:footnotes xmlns:wpc="http://schemas.microsoft.com/office/word/2010/wordprocessingCanvas" xmlns:cx="http://schemas.microsoft.com/office/drawing/2014/chartex" xmlns:cx1="http://schemas.microsoft.com/office/drawing/2015/9/8/chartex" xmlns:cx2="http://schemas.microsoft.com/office/drawing/2015/10/21/chartex" xmlns:cx3="http://schemas.microsoft.com/office/drawing/2016/5/9/chartex" xmlns:cx4="http://schemas.microsoft.com/office/drawing/2016/5/10/chartex" xmlns:cx5="http://schemas.microsoft.com/office/drawing/2016/5/11/chartex" xmlns:cx6="http://schemas.microsoft.com/office/drawing/2016/5/12/chartex" xmlns:cx7="http://schemas.microsoft.com/office/drawing/2016/5/13/chartex" xmlns:cx8="http://schemas.microsoft.com/office/drawing/2016/5/14/chartex" xmlns:mc="http://schemas.openxmlformats.org/markup-compatibility/2006" xmlns:aink="http://schemas.microsoft.com/office/drawing/2016/ink" xmlns:am3d="http://schemas.microsoft.com/office/drawing/2017/model3d" xmlns:o="urn:schemas-microsoft-com:office:office" xmlns:oel="http://schemas.microsoft.com/office/2019/extlst" xmlns:r="http://schemas.openxmlformats.org/officeDocument/2006/relationships" xmlns:m="http://schemas.openxmlformats.org/officeDocument/2006/math" xmlns:v="urn:schemas-microsoft-com:vml" xmlns:wp14="http://schemas.microsoft.com/office/word/2010/wordprocessingDrawing" xmlns:wp="http://schemas.openxmlformats.org/drawingml/2006/wordprocessingDrawing" xmlns:w10="urn:schemas-microsoft-com:office:word" xmlns:w="http://schemas.openxmlformats.org/wordprocessingml/2006/main" xmlns:w14="http://schemas.microsoft.com/office/word/2010/wordml" xmlns:w15="http://schemas.microsoft.com/office/word/2012/wordml" xmlns:w16cex="http://schemas.microsoft.com/office/word/2018/wordml/cex" xmlns:w16cid="http://schemas.microsoft.com/office/word/2016/wordml/cid" xmlns:w16="http://schemas.microsoft.com/office/word/2018/wordml" xmlns:w16du="http://schemas.microsoft.com/office/word/2023/wordml/word16du" xmlns:w16sdtdh="http://schemas.microsoft.com/office/word/2020/wordml/sdtdatahash" xmlns:w16sdtfl="http://schemas.microsoft.com/office/word/2024/wordml/sdtformatlock" xmlns:w16se="http://schemas.microsoft.com/office/word/2015/wordml/symex" xmlns:wpg="http://schemas.microsoft.com/office/word/2010/wordprocessingGroup" xmlns:wpi="http://schemas.microsoft.com/office/word/2010/wordprocessingInk" xmlns:wne="http://schemas.microsoft.com/office/word/2006/wordml" xmlns:wps="http://schemas.microsoft.com/office/word/2010/wordprocessingShape" mc:Ignorable="w14 w15 w16se w16cid w16 w16cex w16sdtdh w16sdtfl w16du wp14">
+<w:footnotes xmlns:wpc="http://schemas.microsoft.com/office/word/2010/wordprocessingCanvas" xmlns:cx="http://schemas.microsoft.com/office/drawing/2014/chartex" xmlns:cx1="http://schemas.microsoft.com/office/drawing/2015/9/8/chartex" xmlns:cx2="http://schemas.microsoft.com/office/drawing/2015/10/21/chartex" xmlns:cx3="http://schemas.microsoft.com/office/drawing/2016/5/9/chartex" xmlns:cx4="http://schemas.microsoft.com/office/drawing/2016/5/10/chartex" xmlns:cx5="http://schemas.microsoft.com/office/drawing/2016/5/11/chartex" xmlns:cx6="http://schemas.microsoft.com/office/drawing/2016/5/12/chartex" xmlns:cx7="http://schemas.microsoft.com/office/drawing/2016/5/13/chartex" xmlns:cx8="http://schemas.microsoft.com/office/drawing/2016/5/14/chartex" xmlns:mc="http://schemas.openxmlformats.org/markup-compatibility/2006" xmlns:aink="http://schemas.microsoft.com/office/drawing/2016/ink" xmlns:am3d="http://schemas.microsoft.com/office/drawing/2017/model3d" xmlns:o="urn:schemas-microsoft-com:office:office" xmlns:oel="http://schemas.microsoft.com/office/2019/extlst" xmlns:r="http://schemas.openxmlformats.org/officeDocument/2006/relationships" xmlns:m="http://schemas.openxmlformats.org/officeDocument/2006/math" xmlns:v="urn:schemas-microsoft-com:vml" xmlns:wp14="http://schemas.microsoft.com/office/word/2010/wordprocessingDrawing" xmlns:wp="http://schemas.openxmlformats.org/drawingml/2006/wordprocessingDrawing" xmlns:w10="urn:schemas-microsoft-com:office:word" xmlns:w="http://schemas.openxmlformats.org/wordprocessingml/2006/main" xmlns:w14="http://schemas.microsoft.com/office/word/2010/wordml" xmlns:w15="http://schemas.microsoft.com/office/word/2012/wordml" xmlns:w16cei="http://schemas.microsoft.com/office/word/2026/wordml/cei" xmlns:w16cex="http://schemas.microsoft.com/office/word/2018/wordml/cex" xmlns:w16cid="http://schemas.microsoft.com/office/word/2016/wordml/cid" xmlns:w16="http://schemas.microsoft.com/office/word/2018/wordml" xmlns:w16du="http://schemas.microsoft.com/office/word/2023/wordml/word16du" xmlns:w16sdtdh="http://schemas.microsoft.com/office/word/2020/wordml/sdtdatahash" xmlns:w16sdtfl="http://schemas.microsoft.com/office/word/2024/wordml/sdtformatlock" xmlns:w16se="http://schemas.microsoft.com/office/word/2015/wordml/symex" xmlns:wpg="http://schemas.microsoft.com/office/word/2010/wordprocessingGroup" xmlns:wpi="http://schemas.microsoft.com/office/word/2010/wordprocessingInk" xmlns:wne="http://schemas.microsoft.com/office/word/2006/wordml" xmlns:wps="http://schemas.microsoft.com/office/word/2010/wordprocessingShape" mc:Ignorable="w14 w15 w16se w16cid w16 w16cex w16sdtdh w16sdtfl w16du wp14">
   <w:footnote w:type="separator" w:id="-1">
     <w:p>
       <w:pPr>
@@ -6668,7 +6475,7 @@
 </file>
 
 <file path=word/header1.xml><?xml version="1.0" encoding="utf-8"?>
-<w:hdr xmlns:wpc="http://schemas.microsoft.com/office/word/2010/wordprocessingCanvas" xmlns:cx="http://schemas.microsoft.com/office/drawing/2014/chartex" xmlns:cx1="http://schemas.microsoft.com/office/drawing/2015/9/8/chartex" xmlns:cx2="http://schemas.microsoft.com/office/drawing/2015/10/21/chartex" xmlns:cx3="http://schemas.microsoft.com/office/drawing/2016/5/9/chartex" xmlns:cx4="http://schemas.microsoft.com/office/drawing/2016/5/10/chartex" xmlns:cx5="http://schemas.microsoft.com/office/drawing/2016/5/11/chartex" xmlns:cx6="http://schemas.microsoft.com/office/drawing/2016/5/12/chartex" xmlns:cx7="http://schemas.microsoft.com/office/drawing/2016/5/13/chartex" xmlns:cx8="http://schemas.microsoft.com/office/drawing/2016/5/14/chartex" xmlns:mc="http://schemas.openxmlformats.org/markup-compatibility/2006" xmlns:aink="http://schemas.microsoft.com/office/drawing/2016/ink" xmlns:am3d="http://schemas.microsoft.com/office/drawing/2017/model3d" xmlns:o="urn:schemas-microsoft-com:office:office" xmlns:oel="http://schemas.microsoft.com/office/2019/extlst" xmlns:r="http://schemas.openxmlformats.org/officeDocument/2006/relationships" xmlns:m="http://schemas.openxmlformats.org/officeDocument/2006/math" xmlns:v="urn:schemas-microsoft-com:vml" xmlns:wp14="http://schemas.microsoft.com/office/word/2010/wordprocessingDrawing" xmlns:wp="http://schemas.openxmlformats.org/drawingml/2006/wordprocessingDrawing" xmlns:w10="urn:schemas-microsoft-com:office:word" xmlns:w="http://schemas.openxmlformats.org/wordprocessingml/2006/main" xmlns:w14="http://schemas.microsoft.com/office/word/2010/wordml" xmlns:w15="http://schemas.microsoft.com/office/word/2012/wordml" xmlns:w16cex="http://schemas.microsoft.com/office/word/2018/wordml/cex" xmlns:w16cid="http://schemas.microsoft.com/office/word/2016/wordml/cid" xmlns:w16="http://schemas.microsoft.com/office/word/2018/wordml" xmlns:w16du="http://schemas.microsoft.com/office/word/2023/wordml/word16du" xmlns:w16sdtdh="http://schemas.microsoft.com/office/word/2020/wordml/sdtdatahash" xmlns:w16sdtfl="http://schemas.microsoft.com/office/word/2024/wordml/sdtformatlock" xmlns:w16se="http://schemas.microsoft.com/office/word/2015/wordml/symex" xmlns:wpg="http://schemas.microsoft.com/office/word/2010/wordprocessingGroup" xmlns:wpi="http://schemas.microsoft.com/office/word/2010/wordprocessingInk" xmlns:wne="http://schemas.microsoft.com/office/word/2006/wordml" xmlns:wps="http://schemas.microsoft.com/office/word/2010/wordprocessingShape" mc:Ignorable="w14 w15 w16se w16cid w16 w16cex w16sdtdh w16sdtfl w16du wp14">
+<w:hdr xmlns:wpc="http://schemas.microsoft.com/office/word/2010/wordprocessingCanvas" xmlns:cx="http://schemas.microsoft.com/office/drawing/2014/chartex" xmlns:cx1="http://schemas.microsoft.com/office/drawing/2015/9/8/chartex" xmlns:cx2="http://schemas.microsoft.com/office/drawing/2015/10/21/chartex" xmlns:cx3="http://schemas.microsoft.com/office/drawing/2016/5/9/chartex" xmlns:cx4="http://schemas.microsoft.com/office/drawing/2016/5/10/chartex" xmlns:cx5="http://schemas.microsoft.com/office/drawing/2016/5/11/chartex" xmlns:cx6="http://schemas.microsoft.com/office/drawing/2016/5/12/chartex" xmlns:cx7="http://schemas.microsoft.com/office/drawing/2016/5/13/chartex" xmlns:cx8="http://schemas.microsoft.com/office/drawing/2016/5/14/chartex" xmlns:mc="http://schemas.openxmlformats.org/markup-compatibility/2006" xmlns:aink="http://schemas.microsoft.com/office/drawing/2016/ink" xmlns:am3d="http://schemas.microsoft.com/office/drawing/2017/model3d" xmlns:o="urn:schemas-microsoft-com:office:office" xmlns:oel="http://schemas.microsoft.com/office/2019/extlst" xmlns:r="http://schemas.openxmlformats.org/officeDocument/2006/relationships" xmlns:m="http://schemas.openxmlformats.org/officeDocument/2006/math" xmlns:v="urn:schemas-microsoft-com:vml" xmlns:wp14="http://schemas.microsoft.com/office/word/2010/wordprocessingDrawing" xmlns:wp="http://schemas.openxmlformats.org/drawingml/2006/wordprocessingDrawing" xmlns:w10="urn:schemas-microsoft-com:office:word" xmlns:w="http://schemas.openxmlformats.org/wordprocessingml/2006/main" xmlns:w14="http://schemas.microsoft.com/office/word/2010/wordml" xmlns:w15="http://schemas.microsoft.com/office/word/2012/wordml" xmlns:w16cei="http://schemas.microsoft.com/office/word/2026/wordml/cei" xmlns:w16cex="http://schemas.microsoft.com/office/word/2018/wordml/cex" xmlns:w16cid="http://schemas.microsoft.com/office/word/2016/wordml/cid" xmlns:w16="http://schemas.microsoft.com/office/word/2018/wordml" xmlns:w16du="http://schemas.microsoft.com/office/word/2023/wordml/word16du" xmlns:w16sdtdh="http://schemas.microsoft.com/office/word/2020/wordml/sdtdatahash" xmlns:w16sdtfl="http://schemas.microsoft.com/office/word/2024/wordml/sdtformatlock" xmlns:w16se="http://schemas.microsoft.com/office/word/2015/wordml/symex" xmlns:wpg="http://schemas.microsoft.com/office/word/2010/wordprocessingGroup" xmlns:wpi="http://schemas.microsoft.com/office/word/2010/wordprocessingInk" xmlns:wne="http://schemas.microsoft.com/office/word/2006/wordml" xmlns:wps="http://schemas.microsoft.com/office/word/2010/wordprocessingShape" mc:Ignorable="w14 w15 w16se w16cid w16 w16cex w16sdtdh w16sdtfl w16du wp14">
   <w:p>
     <w:pPr>
       <w:pStyle w:val="Header"/>
@@ -6745,7 +6552,7 @@
 </file>
 
 <file path=word/header2.xml><?xml version="1.0" encoding="utf-8"?>
-<w:hdr xmlns:wpc="http://schemas.microsoft.com/office/word/2010/wordprocessingCanvas" xmlns:cx="http://schemas.microsoft.com/office/drawing/2014/chartex" xmlns:cx1="http://schemas.microsoft.com/office/drawing/2015/9/8/chartex" xmlns:cx2="http://schemas.microsoft.com/office/drawing/2015/10/21/chartex" xmlns:cx3="http://schemas.microsoft.com/office/drawing/2016/5/9/chartex" xmlns:cx4="http://schemas.microsoft.com/office/drawing/2016/5/10/chartex" xmlns:cx5="http://schemas.microsoft.com/office/drawing/2016/5/11/chartex" xmlns:cx6="http://schemas.microsoft.com/office/drawing/2016/5/12/chartex" xmlns:cx7="http://schemas.microsoft.com/office/drawing/2016/5/13/chartex" xmlns:cx8="http://schemas.microsoft.com/office/drawing/2016/5/14/chartex" xmlns:mc="http://schemas.openxmlformats.org/markup-compatibility/2006" xmlns:aink="http://schemas.microsoft.com/office/drawing/2016/ink" xmlns:am3d="http://schemas.microsoft.com/office/drawing/2017/model3d" xmlns:o="urn:schemas-microsoft-com:office:office" xmlns:oel="http://schemas.microsoft.com/office/2019/extlst" xmlns:r="http://schemas.openxmlformats.org/officeDocument/2006/relationships" xmlns:m="http://schemas.openxmlformats.org/officeDocument/2006/math" xmlns:v="urn:schemas-microsoft-com:vml" xmlns:wp14="http://schemas.microsoft.com/office/word/2010/wordprocessingDrawing" xmlns:wp="http://schemas.openxmlformats.org/drawingml/2006/wordprocessingDrawing" xmlns:w10="urn:schemas-microsoft-com:office:word" xmlns:w="http://schemas.openxmlformats.org/wordprocessingml/2006/main" xmlns:w14="http://schemas.microsoft.com/office/word/2010/wordml" xmlns:w15="http://schemas.microsoft.com/office/word/2012/wordml" xmlns:w16cex="http://schemas.microsoft.com/office/word/2018/wordml/cex" xmlns:w16cid="http://schemas.microsoft.com/office/word/2016/wordml/cid" xmlns:w16="http://schemas.microsoft.com/office/word/2018/wordml" xmlns:w16du="http://schemas.microsoft.com/office/word/2023/wordml/word16du" xmlns:w16sdtdh="http://schemas.microsoft.com/office/word/2020/wordml/sdtdatahash" xmlns:w16sdtfl="http://schemas.microsoft.com/office/word/2024/wordml/sdtformatlock" xmlns:w16se="http://schemas.microsoft.com/office/word/2015/wordml/symex" xmlns:wpg="http://schemas.microsoft.com/office/word/2010/wordprocessingGroup" xmlns:wpi="http://schemas.microsoft.com/office/word/2010/wordprocessingInk" xmlns:wne="http://schemas.microsoft.com/office/word/2006/wordml" xmlns:wps="http://schemas.microsoft.com/office/word/2010/wordprocessingShape" mc:Ignorable="w14 w15 w16se w16cid w16 w16cex w16sdtdh w16sdtfl w16du wp14">
+<w:hdr xmlns:wpc="http://schemas.microsoft.com/office/word/2010/wordprocessingCanvas" xmlns:cx="http://schemas.microsoft.com/office/drawing/2014/chartex" xmlns:cx1="http://schemas.microsoft.com/office/drawing/2015/9/8/chartex" xmlns:cx2="http://schemas.microsoft.com/office/drawing/2015/10/21/chartex" xmlns:cx3="http://schemas.microsoft.com/office/drawing/2016/5/9/chartex" xmlns:cx4="http://schemas.microsoft.com/office/drawing/2016/5/10/chartex" xmlns:cx5="http://schemas.microsoft.com/office/drawing/2016/5/11/chartex" xmlns:cx6="http://schemas.microsoft.com/office/drawing/2016/5/12/chartex" xmlns:cx7="http://schemas.microsoft.com/office/drawing/2016/5/13/chartex" xmlns:cx8="http://schemas.microsoft.com/office/drawing/2016/5/14/chartex" xmlns:mc="http://schemas.openxmlformats.org/markup-compatibility/2006" xmlns:aink="http://schemas.microsoft.com/office/drawing/2016/ink" xmlns:am3d="http://schemas.microsoft.com/office/drawing/2017/model3d" xmlns:o="urn:schemas-microsoft-com:office:office" xmlns:oel="http://schemas.microsoft.com/office/2019/extlst" xmlns:r="http://schemas.openxmlformats.org/officeDocument/2006/relationships" xmlns:m="http://schemas.openxmlformats.org/officeDocument/2006/math" xmlns:v="urn:schemas-microsoft-com:vml" xmlns:wp14="http://schemas.microsoft.com/office/word/2010/wordprocessingDrawing" xmlns:wp="http://schemas.openxmlformats.org/drawingml/2006/wordprocessingDrawing" xmlns:w10="urn:schemas-microsoft-com:office:word" xmlns:w="http://schemas.openxmlformats.org/wordprocessingml/2006/main" xmlns:w14="http://schemas.microsoft.com/office/word/2010/wordml" xmlns:w15="http://schemas.microsoft.com/office/word/2012/wordml" xmlns:w16cei="http://schemas.microsoft.com/office/word/2026/wordml/cei" xmlns:w16cex="http://schemas.microsoft.com/office/word/2018/wordml/cex" xmlns:w16cid="http://schemas.microsoft.com/office/word/2016/wordml/cid" xmlns:w16="http://schemas.microsoft.com/office/word/2018/wordml" xmlns:w16du="http://schemas.microsoft.com/office/word/2023/wordml/word16du" xmlns:w16sdtdh="http://schemas.microsoft.com/office/word/2020/wordml/sdtdatahash" xmlns:w16sdtfl="http://schemas.microsoft.com/office/word/2024/wordml/sdtformatlock" xmlns:w16se="http://schemas.microsoft.com/office/word/2015/wordml/symex" xmlns:wpg="http://schemas.microsoft.com/office/word/2010/wordprocessingGroup" xmlns:wpi="http://schemas.microsoft.com/office/word/2010/wordprocessingInk" xmlns:wne="http://schemas.microsoft.com/office/word/2006/wordml" xmlns:wps="http://schemas.microsoft.com/office/word/2010/wordprocessingShape" mc:Ignorable="w14 w15 w16se w16cid w16 w16cex w16sdtdh w16sdtfl w16du wp14">
   <w:p>
     <w:pPr>
       <w:pStyle w:val="Header"/>
@@ -6755,7 +6562,7 @@
 </file>
 
 <file path=word/header3.xml><?xml version="1.0" encoding="utf-8"?>
-<w:hdr xmlns:wpc="http://schemas.microsoft.com/office/word/2010/wordprocessingCanvas" xmlns:cx="http://schemas.microsoft.com/office/drawing/2014/chartex" xmlns:cx1="http://schemas.microsoft.com/office/drawing/2015/9/8/chartex" xmlns:cx2="http://schemas.microsoft.com/office/drawing/2015/10/21/chartex" xmlns:cx3="http://schemas.microsoft.com/office/drawing/2016/5/9/chartex" xmlns:cx4="http://schemas.microsoft.com/office/drawing/2016/5/10/chartex" xmlns:cx5="http://schemas.microsoft.com/office/drawing/2016/5/11/chartex" xmlns:cx6="http://schemas.microsoft.com/office/drawing/2016/5/12/chartex" xmlns:cx7="http://schemas.microsoft.com/office/drawing/2016/5/13/chartex" xmlns:cx8="http://schemas.microsoft.com/office/drawing/2016/5/14/chartex" xmlns:mc="http://schemas.openxmlformats.org/markup-compatibility/2006" xmlns:aink="http://schemas.microsoft.com/office/drawing/2016/ink" xmlns:am3d="http://schemas.microsoft.com/office/drawing/2017/model3d" xmlns:o="urn:schemas-microsoft-com:office:office" xmlns:oel="http://schemas.microsoft.com/office/2019/extlst" xmlns:r="http://schemas.openxmlformats.org/officeDocument/2006/relationships" xmlns:m="http://schemas.openxmlformats.org/officeDocument/2006/math" xmlns:v="urn:schemas-microsoft-com:vml" xmlns:wp14="http://schemas.microsoft.com/office/word/2010/wordprocessingDrawing" xmlns:wp="http://schemas.openxmlformats.org/drawingml/2006/wordprocessingDrawing" xmlns:w10="urn:schemas-microsoft-com:office:word" xmlns:w="http://schemas.openxmlformats.org/wordprocessingml/2006/main" xmlns:w14="http://schemas.microsoft.com/office/word/2010/wordml" xmlns:w15="http://schemas.microsoft.com/office/word/2012/wordml" xmlns:w16cex="http://schemas.microsoft.com/office/word/2018/wordml/cex" xmlns:w16cid="http://schemas.microsoft.com/office/word/2016/wordml/cid" xmlns:w16="http://schemas.microsoft.com/office/word/2018/wordml" xmlns:w16du="http://schemas.microsoft.com/office/word/2023/wordml/word16du" xmlns:w16sdtdh="http://schemas.microsoft.com/office/word/2020/wordml/sdtdatahash" xmlns:w16sdtfl="http://schemas.microsoft.com/office/word/2024/wordml/sdtformatlock" xmlns:w16se="http://schemas.microsoft.com/office/word/2015/wordml/symex" xmlns:wpg="http://schemas.microsoft.com/office/word/2010/wordprocessingGroup" xmlns:wpi="http://schemas.microsoft.com/office/word/2010/wordprocessingInk" xmlns:wne="http://schemas.microsoft.com/office/word/2006/wordml" xmlns:wps="http://schemas.microsoft.com/office/word/2010/wordprocessingShape" mc:Ignorable="w14 w15 w16se w16cid w16 w16cex w16sdtdh w16sdtfl w16du wp14">
+<w:hdr xmlns:wpc="http://schemas.microsoft.com/office/word/2010/wordprocessingCanvas" xmlns:cx="http://schemas.microsoft.com/office/drawing/2014/chartex" xmlns:cx1="http://schemas.microsoft.com/office/drawing/2015/9/8/chartex" xmlns:cx2="http://schemas.microsoft.com/office/drawing/2015/10/21/chartex" xmlns:cx3="http://schemas.microsoft.com/office/drawing/2016/5/9/chartex" xmlns:cx4="http://schemas.microsoft.com/office/drawing/2016/5/10/chartex" xmlns:cx5="http://schemas.microsoft.com/office/drawing/2016/5/11/chartex" xmlns:cx6="http://schemas.microsoft.com/office/drawing/2016/5/12/chartex" xmlns:cx7="http://schemas.microsoft.com/office/drawing/2016/5/13/chartex" xmlns:cx8="http://schemas.microsoft.com/office/drawing/2016/5/14/chartex" xmlns:mc="http://schemas.openxmlformats.org/markup-compatibility/2006" xmlns:aink="http://schemas.microsoft.com/office/drawing/2016/ink" xmlns:am3d="http://schemas.microsoft.com/office/drawing/2017/model3d" xmlns:o="urn:schemas-microsoft-com:office:office" xmlns:oel="http://schemas.microsoft.com/office/2019/extlst" xmlns:r="http://schemas.openxmlformats.org/officeDocument/2006/relationships" xmlns:m="http://schemas.openxmlformats.org/officeDocument/2006/math" xmlns:v="urn:schemas-microsoft-com:vml" xmlns:wp14="http://schemas.microsoft.com/office/word/2010/wordprocessingDrawing" xmlns:wp="http://schemas.openxmlformats.org/drawingml/2006/wordprocessingDrawing" xmlns:w10="urn:schemas-microsoft-com:office:word" xmlns:w="http://schemas.openxmlformats.org/wordprocessingml/2006/main" xmlns:w14="http://schemas.microsoft.com/office/word/2010/wordml" xmlns:w15="http://schemas.microsoft.com/office/word/2012/wordml" xmlns:w16cei="http://schemas.microsoft.com/office/word/2026/wordml/cei" xmlns:w16cex="http://schemas.microsoft.com/office/word/2018/wordml/cex" xmlns:w16cid="http://schemas.microsoft.com/office/word/2016/wordml/cid" xmlns:w16="http://schemas.microsoft.com/office/word/2018/wordml" xmlns:w16du="http://schemas.microsoft.com/office/word/2023/wordml/word16du" xmlns:w16sdtdh="http://schemas.microsoft.com/office/word/2020/wordml/sdtdatahash" xmlns:w16sdtfl="http://schemas.microsoft.com/office/word/2024/wordml/sdtformatlock" xmlns:w16se="http://schemas.microsoft.com/office/word/2015/wordml/symex" xmlns:wpg="http://schemas.microsoft.com/office/word/2010/wordprocessingGroup" xmlns:wpi="http://schemas.microsoft.com/office/word/2010/wordprocessingInk" xmlns:wne="http://schemas.microsoft.com/office/word/2006/wordml" xmlns:wps="http://schemas.microsoft.com/office/word/2010/wordprocessingShape" mc:Ignorable="w14 w15 w16se w16cid w16 w16cex w16sdtdh w16sdtfl w16du wp14">
   <w:p>
     <w:pPr>
       <w:pStyle w:val="Header"/>
@@ -6765,7 +6572,7 @@
 </file>
 
 <file path=word/numbering.xml><?xml version="1.0" encoding="utf-8"?>
-<w:numbering xmlns:wpc="http://schemas.microsoft.com/office/word/2010/wordprocessingCanvas" xmlns:cx="http://schemas.microsoft.com/office/drawing/2014/chartex" xmlns:cx1="http://schemas.microsoft.com/office/drawing/2015/9/8/chartex" xmlns:cx2="http://schemas.microsoft.com/office/drawing/2015/10/21/chartex" xmlns:cx3="http://schemas.microsoft.com/office/drawing/2016/5/9/chartex" xmlns:cx4="http://schemas.microsoft.com/office/drawing/2016/5/10/chartex" xmlns:cx5="http://schemas.microsoft.com/office/drawing/2016/5/11/chartex" xmlns:cx6="http://schemas.microsoft.com/office/drawing/2016/5/12/chartex" xmlns:cx7="http://schemas.microsoft.com/office/drawing/2016/5/13/chartex" xmlns:cx8="http://schemas.microsoft.com/office/drawing/2016/5/14/chartex" xmlns:mc="http://schemas.openxmlformats.org/markup-compatibility/2006" xmlns:aink="http://schemas.microsoft.com/office/drawing/2016/ink" xmlns:am3d="http://schemas.microsoft.com/office/drawing/2017/model3d" xmlns:o="urn:schemas-microsoft-com:office:office" xmlns:oel="http://schemas.microsoft.com/office/2019/extlst" xmlns:r="http://schemas.openxmlformats.org/officeDocument/2006/relationships" xmlns:m="http://schemas.openxmlformats.org/officeDocument/2006/math" xmlns:v="urn:schemas-microsoft-com:vml" xmlns:wp14="http://schemas.microsoft.com/office/word/2010/wordprocessingDrawing" xmlns:wp="http://schemas.openxmlformats.org/drawingml/2006/wordprocessingDrawing" xmlns:w10="urn:schemas-microsoft-com:office:word" xmlns:w="http://schemas.openxmlformats.org/wordprocessingml/2006/main" xmlns:w14="http://schemas.microsoft.com/office/word/2010/wordml" xmlns:w15="http://schemas.microsoft.com/office/word/2012/wordml" xmlns:w16cex="http://schemas.microsoft.com/office/word/2018/wordml/cex" xmlns:w16cid="http://schemas.microsoft.com/office/word/2016/wordml/cid" xmlns:w16="http://schemas.microsoft.com/office/word/2018/wordml" xmlns:w16du="http://schemas.microsoft.com/office/word/2023/wordml/word16du" xmlns:w16sdtdh="http://schemas.microsoft.com/office/word/2020/wordml/sdtdatahash" xmlns:w16sdtfl="http://schemas.microsoft.com/office/word/2024/wordml/sdtformatlock" xmlns:w16se="http://schemas.microsoft.com/office/word/2015/wordml/symex" xmlns:wpg="http://schemas.microsoft.com/office/word/2010/wordprocessingGroup" xmlns:wpi="http://schemas.microsoft.com/office/word/2010/wordprocessingInk" xmlns:wne="http://schemas.microsoft.com/office/word/2006/wordml" xmlns:wps="http://schemas.microsoft.com/office/word/2010/wordprocessingShape" mc:Ignorable="w14 w15 w16se w16cid w16 w16cex w16sdtdh w16sdtfl w16du wp14">
+<w:numbering xmlns:wpc="http://schemas.microsoft.com/office/word/2010/wordprocessingCanvas" xmlns:cx="http://schemas.microsoft.com/office/drawing/2014/chartex" xmlns:cx1="http://schemas.microsoft.com/office/drawing/2015/9/8/chartex" xmlns:cx2="http://schemas.microsoft.com/office/drawing/2015/10/21/chartex" xmlns:cx3="http://schemas.microsoft.com/office/drawing/2016/5/9/chartex" xmlns:cx4="http://schemas.microsoft.com/office/drawing/2016/5/10/chartex" xmlns:cx5="http://schemas.microsoft.com/office/drawing/2016/5/11/chartex" xmlns:cx6="http://schemas.microsoft.com/office/drawing/2016/5/12/chartex" xmlns:cx7="http://schemas.microsoft.com/office/drawing/2016/5/13/chartex" xmlns:cx8="http://schemas.microsoft.com/office/drawing/2016/5/14/chartex" xmlns:mc="http://schemas.openxmlformats.org/markup-compatibility/2006" xmlns:aink="http://schemas.microsoft.com/office/drawing/2016/ink" xmlns:am3d="http://schemas.microsoft.com/office/drawing/2017/model3d" xmlns:o="urn:schemas-microsoft-com:office:office" xmlns:oel="http://schemas.microsoft.com/office/2019/extlst" xmlns:r="http://schemas.openxmlformats.org/officeDocument/2006/relationships" xmlns:m="http://schemas.openxmlformats.org/officeDocument/2006/math" xmlns:v="urn:schemas-microsoft-com:vml" xmlns:wp14="http://schemas.microsoft.com/office/word/2010/wordprocessingDrawing" xmlns:wp="http://schemas.openxmlformats.org/drawingml/2006/wordprocessingDrawing" xmlns:w10="urn:schemas-microsoft-com:office:word" xmlns:w="http://schemas.openxmlformats.org/wordprocessingml/2006/main" xmlns:w14="http://schemas.microsoft.com/office/word/2010/wordml" xmlns:w15="http://schemas.microsoft.com/office/word/2012/wordml" xmlns:w16cei="http://schemas.microsoft.com/office/word/2026/wordml/cei" xmlns:w16cex="http://schemas.microsoft.com/office/word/2018/wordml/cex" xmlns:w16cid="http://schemas.microsoft.com/office/word/2016/wordml/cid" xmlns:w16="http://schemas.microsoft.com/office/word/2018/wordml" xmlns:w16du="http://schemas.microsoft.com/office/word/2023/wordml/word16du" xmlns:w16sdtdh="http://schemas.microsoft.com/office/word/2020/wordml/sdtdatahash" xmlns:w16sdtfl="http://schemas.microsoft.com/office/word/2024/wordml/sdtformatlock" xmlns:w16se="http://schemas.microsoft.com/office/word/2015/wordml/symex" xmlns:wpg="http://schemas.microsoft.com/office/word/2010/wordprocessingGroup" xmlns:wpi="http://schemas.microsoft.com/office/word/2010/wordprocessingInk" xmlns:wne="http://schemas.microsoft.com/office/word/2006/wordml" xmlns:wps="http://schemas.microsoft.com/office/word/2010/wordprocessingShape" mc:Ignorable="w14 w15 w16se w16cid w16 w16cex w16sdtdh w16sdtfl w16du wp14">
   <w:abstractNum w:abstractNumId="0" w15:restartNumberingAfterBreak="0">
     <w:nsid w:val="03E34318"/>
     <w:multiLevelType w:val="multilevel"/>

</xml_diff>